<commit_message>
Update M1 report with DYS milestone dates
</commit_message>
<xml_diff>
--- a/docs/m1/M1-Project-Initiation-Report.docx
+++ b/docs/m1/M1-Project-Initiation-Report.docx
@@ -34,7 +34,7 @@
     </w:p>
     <w:p>
       <w:r>
-        <w:t>Team name/number: GoodTracker (course team number to confirm)</w:t>
+        <w:t>Team name/number: GoodTracker</w:t>
       </w:r>
     </w:p>
     <w:p>
@@ -44,17 +44,17 @@
     </w:p>
     <w:p>
       <w:r>
-        <w:t>Submission date: To be confirmed in the LMS</w:t>
+        <w:t>Submission date: Pending; DYS deadline 22 October 2026 (one team member submits)</w:t>
       </w:r>
     </w:p>
     <w:p>
       <w:r>
-        <w:t>Document version: 0.1 - team review draft, 21 October 2026</w:t>
+        <w:t>Document version: 0.2 - team review draft, 21 October 2026</w:t>
       </w:r>
     </w:p>
     <w:p>
       <w:r>
-        <w:t>Repository/project board link: See the Evidence appendix</w:t>
+        <w:t>Repository/project board link: https://github.com/keremtuna0/good_tracker | https://github.com/users/keremtuna0/projects/2</w:t>
       </w:r>
     </w:p>
     <w:p/>
@@ -69,7 +69,7 @@
     </w:p>
     <w:p>
       <w:r>
-        <w:t>GoodTracker is our planned Android app for reserving shared laboratory and office equipment. Borrowers need a simple way to see what is available and request an item without creating overlapping bookings. Staff need a way to keep equipment records and decide on requests. For the first version, we will focus on sign-in, equipment browsing, availability, reservation requests and cancellation, and staff approval. Payments, university single sign-on, push notifications and an app-store release are outside this scope. In M1, we set the project objectives and boundaries, mapped the main stakeholder groups, chose a hybrid delivery approach, and listed success checks and initial risks. These are planning decisions; the app and its tests are not complete yet. The stakeholder needs are initial assumptions because no interview evidence is recorded. Our next steps are to confirm the course submission details, review this report as a team, and prepare the M2 backlog, estimates, schedule and quality plan. We will use repository commits and the project board to track actual work.</w:t>
+        <w:t>GoodTracker is our planned Android app for reserving shared laboratory and office equipment. Borrowers need a simple way to see what is available and request an item without creating overlapping bookings. Staff need a way to keep equipment records and decide on requests. For the first version, we will focus on sign-in, equipment browsing, availability, reservation requests and cancellation, and staff approval. Payments, university single sign-on, push notifications and an app-store release are outside this scope. In M1, we set the project objectives and boundaries, mapped the main stakeholder groups, chose a hybrid delivery approach, and listed success checks and initial risks. These are planning decisions; the app and its tests are not complete yet. The stakeholder needs are initial assumptions because no interview evidence is recorded. Our next steps are to review this report as a team and submit it through DYS by 22 October 2026, then prepare the M2 backlog, estimates, schedule and quality plan for 1 November. We will use repository commits and the project board to track actual work.</w:t>
       </w:r>
     </w:p>
     <w:p>
@@ -524,7 +524,7 @@
     </w:p>
     <w:p>
       <w:r>
-        <w:t>The work must fit the SE3003 milestones and a four-person student team. The first demo is limited to Android. The LMS deadline still needs checking. We do not yet have confirmed access to real equipment records or users, and no paid-service budget is recorded. The app and backend have not been built yet.</w:t>
+        <w:t>The work must fit the SE3003 milestones and a four-person student team. The M1 report is due through DYS on 22 October 2026, with one team member submitting for the group. The first demo is limited to Android. We do not yet have confirmed access to real equipment records or users, and no paid-service budget is recorded. The app and backend have not been built yet.</w:t>
       </w:r>
     </w:p>
     <w:p>
@@ -1219,7 +1219,7 @@
     </w:p>
     <w:p>
       <w:r>
-        <w:t>We chose a hybrid approach. Fixed course milestones require planned reports and decisions, while our four-person team needs room to refine the mobile flow and API after feedback. A fully predictive plan would be hard to change; a purely agile plan would not cover the required baseline. We plan two-week work cycles and will set the detailed sprint plan in M2.</w:t>
+        <w:t>Predictive is too rigid for an untested booking flow; pure Agile misses the fixed M1-M5 reports. We chose Hybrid so our four-person team can plan milestones and refine the app in short cycles. We will detail these cycles in M2.</w:t>
       </w:r>
     </w:p>
     <w:p>
@@ -2954,13 +2954,13 @@
           </w:tcPr>
           <w:p>
             <w:pPr>
-              <w:spacing w:after="0" w:before="0"/>
+              <w:spacing w:after="0"/>
             </w:pPr>
             <w:r>
               <w:rPr>
                 <w:sz w:val="16"/>
               </w:rPr>
-              <w:t>This Word and PDF draft combine the sections.</w:t>
+              <w:t>Word and PDF draft assembled; DYS deadline confirmed.</w:t>
             </w:r>
           </w:p>
         </w:tc>
@@ -2971,13 +2971,13 @@
           </w:tcPr>
           <w:p>
             <w:pPr>
-              <w:spacing w:after="0" w:before="0"/>
+              <w:spacing w:after="0"/>
             </w:pPr>
             <w:r>
               <w:rPr>
                 <w:sz w:val="16"/>
               </w:rPr>
-              <w:t>Review and submission pending</w:t>
+              <w:t>Team review and DYS submission pending</w:t>
             </w:r>
           </w:p>
         </w:tc>
@@ -2988,13 +2988,13 @@
           </w:tcPr>
           <w:p>
             <w:pPr>
-              <w:spacing w:after="0" w:before="0"/>
+              <w:spacing w:after="0"/>
             </w:pPr>
             <w:r>
               <w:rPr>
                 <w:sz w:val="16"/>
               </w:rPr>
-              <w:t>LMS details still need confirmation.</w:t>
+              <w:t>Approval and upload are not recorded yet.</w:t>
             </w:r>
           </w:p>
         </w:tc>
@@ -3005,13 +3005,13 @@
           </w:tcPr>
           <w:p>
             <w:pPr>
-              <w:spacing w:after="0" w:before="0"/>
+              <w:spacing w:after="0"/>
             </w:pPr>
             <w:r>
               <w:rPr>
                 <w:sz w:val="16"/>
               </w:rPr>
-              <w:t>Confirm deadline, review, then submit.</w:t>
+              <w:t>Review and submit once through DYS by 22 October.</w:t>
             </w:r>
           </w:p>
         </w:tc>
@@ -3148,13 +3148,13 @@
           </w:tcPr>
           <w:p>
             <w:pPr>
-              <w:spacing w:after="0" w:before="0"/>
+              <w:spacing w:after="0"/>
             </w:pPr>
             <w:r>
               <w:rPr>
                 <w:sz w:val="17"/>
               </w:rPr>
-              <w:t>Before M2; LMS date to confirm</w:t>
+              <w:t>1 November 2026 (DYS)</w:t>
             </w:r>
           </w:p>
         </w:tc>
@@ -3221,13 +3221,13 @@
           </w:tcPr>
           <w:p>
             <w:pPr>
-              <w:spacing w:after="0" w:before="0"/>
+              <w:spacing w:after="0"/>
             </w:pPr>
             <w:r>
               <w:rPr>
                 <w:sz w:val="17"/>
               </w:rPr>
-              <w:t>Before M2; LMS date to confirm</w:t>
+              <w:t>1 November 2026 (DYS)</w:t>
             </w:r>
           </w:p>
         </w:tc>
@@ -3294,13 +3294,13 @@
           </w:tcPr>
           <w:p>
             <w:pPr>
-              <w:spacing w:after="0" w:before="0"/>
+              <w:spacing w:after="0"/>
             </w:pPr>
             <w:r>
               <w:rPr>
                 <w:sz w:val="17"/>
               </w:rPr>
-              <w:t>Before M2; LMS date to confirm</w:t>
+              <w:t>1 November 2026 (DYS)</w:t>
             </w:r>
           </w:p>
         </w:tc>
@@ -3367,13 +3367,13 @@
           </w:tcPr>
           <w:p>
             <w:pPr>
-              <w:spacing w:after="0" w:before="0"/>
+              <w:spacing w:after="0"/>
             </w:pPr>
             <w:r>
               <w:rPr>
                 <w:sz w:val="17"/>
               </w:rPr>
-              <w:t>Before M2; LMS date to confirm</w:t>
+              <w:t>1 November 2026 (DYS)</w:t>
             </w:r>
           </w:p>
         </w:tc>
@@ -3397,6 +3397,14 @@
       </w:tr>
     </w:tbl>
     <w:p/>
+    <w:p>
+      <w:pPr>
+        <w:spacing w:after="100"/>
+      </w:pPr>
+      <w:r>
+        <w:t>The weekly report for 19-25 October is a separate submission due through DYS on 26 October 2026 at 23:59.</w:t>
+      </w:r>
+    </w:p>
     <w:p>
       <w:pPr>
         <w:pStyle w:val="Balk1"/>
@@ -3704,7 +3712,7 @@
     </w:p>
     <w:p>
       <w:r>
-        <w:t>The links below show the work available in the repository. Interview notes, executed tests and a team review record are not available yet.</w:t>
+        <w:t>The links below show the work available in the repository and the DYS deadline announcement. Interview notes, executed tests, a team review record and a DYS submission receipt are not available yet.</w:t>
       </w:r>
     </w:p>
     <w:p>
@@ -3789,6 +3797,20 @@
       </w:hyperlink>
       <w:r>
         <w:t xml:space="preserve"> - approach and risk section by Kardelen, merged into main.</w:t>
+      </w:r>
+    </w:p>
+    <w:p>
+      <w:pPr/>
+      <w:hyperlink r:id="rId14">
+        <w:r>
+          <w:rPr>
+            <w:color w:val="365F91"/>
+          </w:rPr>
+          <w:t>DYS deadline announcement</w:t>
+        </w:r>
+      </w:hyperlink>
+      <w:r>
+        <w:t xml:space="preserve"> - shows M1 due 22 October, M2 due 1 November, and the separate weekly report due 26 October 2026 at 23:59.</w:t>
       </w:r>
     </w:p>
     <w:sectPr>

</xml_diff>

<commit_message>
Finalize reviewed M1 report
</commit_message>
<xml_diff>
--- a/docs/m1/M1-Project-Initiation-Report.docx
+++ b/docs/m1/M1-Project-Initiation-Report.docx
@@ -44,12 +44,12 @@
     </w:p>
     <w:p>
       <w:r>
-        <w:t>Submission date: Pending; DYS deadline 22 October 2026 (one team member submits)</w:t>
+        <w:t>Submission date: 21 October 2026</w:t>
       </w:r>
     </w:p>
     <w:p>
       <w:r>
-        <w:t>Document version: 0.2 - team review draft, 21 October 2026</w:t>
+        <w:t>Document version: 1.0 - team reviewed, 21 October 2026</w:t>
       </w:r>
     </w:p>
     <w:p>
@@ -69,7 +69,7 @@
     </w:p>
     <w:p>
       <w:r>
-        <w:t>GoodTracker is our planned Android app for reserving shared laboratory and office equipment. Borrowers need a simple way to see what is available and request an item without creating overlapping bookings. Staff need a way to keep equipment records and decide on requests. For the first version, we will focus on sign-in, equipment browsing, availability, reservation requests and cancellation, and staff approval. Payments, university single sign-on, push notifications and an app-store release are outside this scope. In M1, we set the project objectives and boundaries, mapped the main stakeholder groups, chose a hybrid delivery approach, and listed success checks and initial risks. These are planning decisions; the app and its tests are not complete yet. The stakeholder needs are initial assumptions because no interview evidence is recorded. Our next steps are to review this report as a team and submit it through DYS by 22 October 2026, then prepare the M2 backlog, estimates, schedule and quality plan for 1 November. We will use repository commits and the project board to track actual work.</w:t>
+        <w:t>GoodTracker is our planned Android app for reserving shared laboratory and office equipment. Borrowers need a simple way to see what is available and request an item without creating overlapping bookings. Staff need a way to keep equipment records and decide on requests. For the first version, we will focus on sign-in, equipment browsing, availability, reservation requests and cancellation, and staff approval. Payments, university single sign-on, push notifications and an app-store release are outside this scope. In M1, we set the project objectives and boundaries, mapped the main stakeholder groups, chose a hybrid delivery approach, and listed success checks and initial risks. These are planning decisions; the app and its tests are not complete yet. The stakeholder needs are initial assumptions because no interview evidence is recorded. Our next step is to submit this report through DYS by 22 October 2026, then prepare the M2 backlog, estimates, schedule and quality plan for 1 November. We will use repository commits and the project board to track actual work.</w:t>
       </w:r>
     </w:p>
     <w:p>
@@ -2600,7 +2600,7 @@
               <w:rPr>
                 <w:sz w:val="16"/>
               </w:rPr>
-              <w:t>Charter added to main (a3496ca).</w:t>
+              <w:t>Charter added to main (a3496ca) and reviewed by the team.</w:t>
             </w:r>
           </w:p>
         </w:tc>
@@ -2617,7 +2617,7 @@
               <w:rPr>
                 <w:sz w:val="16"/>
               </w:rPr>
-              <w:t>Team review pending</w:t>
+              <w:t>No remaining review action</w:t>
             </w:r>
           </w:p>
         </w:tc>
@@ -2651,7 +2651,7 @@
               <w:rPr>
                 <w:sz w:val="16"/>
               </w:rPr>
-              <w:t>Review it in the shared report.</w:t>
+              <w:t>No further action from the team review.</w:t>
             </w:r>
           </w:p>
         </w:tc>
@@ -2921,7 +2921,7 @@
               <w:rPr>
                 <w:sz w:val="16"/>
               </w:rPr>
-              <w:t>Team to review this report.</w:t>
+              <w:t>Record peer reviews on future PRs.</w:t>
             </w:r>
           </w:p>
         </w:tc>
@@ -2960,7 +2960,7 @@
               <w:rPr>
                 <w:sz w:val="16"/>
               </w:rPr>
-              <w:t>Word and PDF draft assembled; DYS deadline confirmed.</w:t>
+              <w:t>Word report completed and reviewed; DYS deadline confirmed.</w:t>
             </w:r>
           </w:p>
         </w:tc>
@@ -2977,7 +2977,7 @@
               <w:rPr>
                 <w:sz w:val="16"/>
               </w:rPr>
-              <w:t>Team review and DYS submission pending</w:t>
+              <w:t>DYS submission pending</w:t>
             </w:r>
           </w:p>
         </w:tc>
@@ -2994,7 +2994,7 @@
               <w:rPr>
                 <w:sz w:val="16"/>
               </w:rPr>
-              <w:t>Approval and upload are not recorded yet.</w:t>
+              <w:t>DYS upload has not happened yet.</w:t>
             </w:r>
           </w:p>
         </w:tc>
@@ -3011,7 +3011,7 @@
               <w:rPr>
                 <w:sz w:val="16"/>
               </w:rPr>
-              <w:t>Review and submit once through DYS by 22 October.</w:t>
+              <w:t>Submit once through DYS by 22 October.</w:t>
             </w:r>
           </w:p>
         </w:tc>
@@ -3676,7 +3676,7 @@
               <w:rPr>
                 <w:sz w:val="17"/>
               </w:rPr>
-              <w:t>Project charter, risk wording alignment and coordination of this report draft.</w:t>
+              <w:t>Project charter, risk wording alignment and coordination of this report.</w:t>
             </w:r>
           </w:p>
         </w:tc>
@@ -3712,7 +3712,7 @@
     </w:p>
     <w:p>
       <w:r>
-        <w:t>The links below show the work available in the repository and the DYS deadline announcement. Interview notes, executed tests, a team review record and a DYS submission receipt are not available yet.</w:t>
+        <w:t>The links below show the work available in the repository and the DYS deadline announcement. The team reviewed this report. Interview notes, executed tests and a DYS submission receipt are not available yet.</w:t>
       </w:r>
     </w:p>
     <w:p>

</xml_diff>